<commit_message>
Updated data science project checklist
</commit_message>
<xml_diff>
--- a/resources/resource-page-files/data-science/data-science-project-checklist/data-science-project-checklist.docx
+++ b/resources/resource-page-files/data-science/data-science-project-checklist/data-science-project-checklist.docx
@@ -23,13 +23,8 @@
         <w:jc w:val="center"/>
       </w:pPr>
       <w:r>
-        <w:t xml:space="preserve">Created by Jake </w:t>
+        <w:t>Created by Jake Strasler</w:t>
       </w:r>
-      <w:proofErr w:type="spellStart"/>
-      <w:r>
-        <w:t>Strasler</w:t>
-      </w:r>
-      <w:proofErr w:type="spellEnd"/>
     </w:p>
     <w:p>
       <w:pPr>
@@ -53,34 +48,33 @@
         <w:t xml:space="preserve">This checklist is a print-friendly, interactable translation of </w:t>
       </w:r>
       <w:hyperlink r:id="rId8" w:history="1">
-        <w:proofErr w:type="spellStart"/>
         <w:r>
           <w:rPr>
             <w:rStyle w:val="Hyperlink"/>
           </w:rPr>
-          <w:t>DataCamp’s</w:t>
-        </w:r>
-        <w:proofErr w:type="spellEnd"/>
-        <w:r>
-          <w:rPr>
-            <w:rStyle w:val="Hyperlink"/>
-          </w:rPr>
-          <w:t xml:space="preserve"> Data Science Project Checklist.</w:t>
+          <w:t>DataCamp’s Data Science Project Checklist.</w:t>
         </w:r>
       </w:hyperlink>
       <w:r>
-        <w:t xml:space="preserve"> </w:t>
-      </w:r>
-      <w:proofErr w:type="spellStart"/>
-      <w:r>
-        <w:t>DataCamp</w:t>
-      </w:r>
-      <w:proofErr w:type="spellEnd"/>
-      <w:r>
-        <w:t xml:space="preserve"> describes the checklist as “summarizing data science project management best practices [and] combines CRISP-DM project management principles with those of the Agile and Scrum software development frameworks.”</w:t>
+        <w:t xml:space="preserve"> DataCamp describes the checklist as “summarizing data science project management best practices</w:t>
       </w:r>
       <w:r>
-        <w:t xml:space="preserve"> I intend for this checklist to be used for every data science project I am a part of.</w:t>
+        <w:t>…</w:t>
+      </w:r>
+      <w:r>
+        <w:t xml:space="preserve">” </w:t>
+      </w:r>
+      <w:r>
+        <w:t xml:space="preserve">and </w:t>
+      </w:r>
+      <w:r>
+        <w:t>“</w:t>
+      </w:r>
+      <w:r>
+        <w:t>…</w:t>
+      </w:r>
+      <w:r>
+        <w:t>combines CRISP-DM project management principles with those of the Agile and Scrum software development frameworks.”</w:t>
       </w:r>
     </w:p>
     <w:p>
@@ -241,6 +235,9 @@
         <w:jc w:val="both"/>
       </w:pPr>
       <w:r>
+        <w:rPr>
+          <w:noProof/>
+        </w:rPr>
         <mc:AlternateContent>
           <mc:Choice Requires="wps">
             <w:drawing>
@@ -319,6 +316,9 @@
         </mc:AlternateContent>
       </w:r>
       <w:r>
+        <w:rPr>
+          <w:noProof/>
+        </w:rPr>
         <mc:AlternateContent>
           <mc:Choice Requires="wps">
             <w:drawing>
@@ -393,6 +393,9 @@
         </mc:AlternateContent>
       </w:r>
       <w:r>
+        <w:rPr>
+          <w:noProof/>
+        </w:rPr>
         <mc:AlternateContent>
           <mc:Choice Requires="wps">
             <w:drawing>
@@ -467,6 +470,9 @@
         </mc:AlternateContent>
       </w:r>
       <w:r>
+        <w:rPr>
+          <w:noProof/>
+        </w:rPr>
         <mc:AlternateContent>
           <mc:Choice Requires="wps">
             <w:drawing>
@@ -596,6 +602,9 @@
         </mc:AlternateContent>
       </w:r>
       <w:r>
+        <w:rPr>
+          <w:noProof/>
+        </w:rPr>
         <mc:AlternateContent>
           <mc:Choice Requires="wps">
             <w:drawing>
@@ -741,6 +750,9 @@
         </mc:AlternateContent>
       </w:r>
       <w:r>
+        <w:rPr>
+          <w:noProof/>
+        </w:rPr>
         <mc:AlternateContent>
           <mc:Choice Requires="wps">
             <w:drawing>
@@ -870,6 +882,9 @@
         </mc:AlternateContent>
       </w:r>
       <w:r>
+        <w:rPr>
+          <w:noProof/>
+        </w:rPr>
         <mc:AlternateContent>
           <mc:Choice Requires="wps">
             <w:drawing>
@@ -1031,6 +1046,9 @@
         </mc:AlternateContent>
       </w:r>
       <w:r>
+        <w:rPr>
+          <w:noProof/>
+        </w:rPr>
         <mc:AlternateContent>
           <mc:Choice Requires="wps">
             <w:drawing>
@@ -1713,6 +1731,9 @@
         </mc:AlternateContent>
       </w:r>
       <w:r>
+        <w:rPr>
+          <w:noProof/>
+        </w:rPr>
         <mc:AlternateContent>
           <mc:Choice Requires="wps">
             <w:drawing>
@@ -1898,6 +1919,9 @@
               <w:instrText xml:space="preserve"> FORMCHECKBOX </w:instrText>
             </w:r>
             <w:r>
+              <w:fldChar w:fldCharType="separate"/>
+            </w:r>
+            <w:r>
               <w:fldChar w:fldCharType="end"/>
             </w:r>
             <w:bookmarkEnd w:id="0"/>
@@ -1967,6 +1991,9 @@
               <w:instrText xml:space="preserve"> FORMCHECKBOX </w:instrText>
             </w:r>
             <w:r>
+              <w:fldChar w:fldCharType="separate"/>
+            </w:r>
+            <w:r>
               <w:fldChar w:fldCharType="end"/>
             </w:r>
           </w:p>
@@ -2035,6 +2062,9 @@
               <w:instrText xml:space="preserve"> FORMCHECKBOX </w:instrText>
             </w:r>
             <w:r>
+              <w:fldChar w:fldCharType="separate"/>
+            </w:r>
+            <w:r>
               <w:fldChar w:fldCharType="end"/>
             </w:r>
           </w:p>
@@ -2103,6 +2133,9 @@
               <w:instrText xml:space="preserve"> FORMCHECKBOX </w:instrText>
             </w:r>
             <w:r>
+              <w:fldChar w:fldCharType="separate"/>
+            </w:r>
+            <w:r>
               <w:fldChar w:fldCharType="end"/>
             </w:r>
           </w:p>
@@ -2171,6 +2204,9 @@
               <w:instrText xml:space="preserve"> FORMCHECKBOX </w:instrText>
             </w:r>
             <w:r>
+              <w:fldChar w:fldCharType="separate"/>
+            </w:r>
+            <w:r>
               <w:fldChar w:fldCharType="end"/>
             </w:r>
           </w:p>
@@ -2196,23 +2232,7 @@
                 <w:i/>
                 <w:iCs/>
               </w:rPr>
-              <w:t xml:space="preserve">What are the deliverables? What are the </w:t>
-            </w:r>
-            <w:proofErr w:type="spellStart"/>
-            <w:r>
-              <w:rPr>
-                <w:i/>
-                <w:iCs/>
-              </w:rPr>
-              <w:t>reqs</w:t>
-            </w:r>
-            <w:proofErr w:type="spellEnd"/>
-            <w:r>
-              <w:rPr>
-                <w:i/>
-                <w:iCs/>
-              </w:rPr>
-              <w:t>. for the deliverables? What will not be included?</w:t>
+              <w:t>What are the deliverables? What are the reqs. for the deliverables? What will not be included?</w:t>
             </w:r>
           </w:p>
         </w:tc>
@@ -2253,6 +2273,9 @@
             </w:r>
             <w:r>
               <w:instrText xml:space="preserve"> FORMCHECKBOX </w:instrText>
+            </w:r>
+            <w:r>
+              <w:fldChar w:fldCharType="separate"/>
             </w:r>
             <w:r>
               <w:fldChar w:fldCharType="end"/>
@@ -2347,6 +2370,9 @@
             </w:r>
             <w:r>
               <w:instrText xml:space="preserve"> FORMCHECKBOX </w:instrText>
+            </w:r>
+            <w:r>
+              <w:fldChar w:fldCharType="separate"/>
             </w:r>
             <w:r>
               <w:fldChar w:fldCharType="end"/>
@@ -2534,6 +2560,9 @@
               <w:instrText xml:space="preserve"> FORMCHECKBOX </w:instrText>
             </w:r>
             <w:r>
+              <w:fldChar w:fldCharType="separate"/>
+            </w:r>
+            <w:r>
               <w:fldChar w:fldCharType="end"/>
             </w:r>
           </w:p>
@@ -2602,6 +2631,9 @@
               <w:instrText xml:space="preserve"> FORMCHECKBOX </w:instrText>
             </w:r>
             <w:r>
+              <w:fldChar w:fldCharType="separate"/>
+            </w:r>
+            <w:r>
               <w:fldChar w:fldCharType="end"/>
             </w:r>
           </w:p>
@@ -2670,6 +2702,9 @@
               <w:instrText xml:space="preserve"> FORMCHECKBOX </w:instrText>
             </w:r>
             <w:r>
+              <w:fldChar w:fldCharType="separate"/>
+            </w:r>
+            <w:r>
               <w:fldChar w:fldCharType="end"/>
             </w:r>
           </w:p>
@@ -2744,6 +2779,9 @@
               <w:instrText xml:space="preserve"> FORMCHECKBOX </w:instrText>
             </w:r>
             <w:r>
+              <w:fldChar w:fldCharType="separate"/>
+            </w:r>
+            <w:r>
               <w:fldChar w:fldCharType="end"/>
             </w:r>
           </w:p>
@@ -2818,6 +2856,9 @@
               <w:instrText xml:space="preserve"> FORMCHECKBOX </w:instrText>
             </w:r>
             <w:r>
+              <w:fldChar w:fldCharType="separate"/>
+            </w:r>
+            <w:r>
               <w:fldChar w:fldCharType="end"/>
             </w:r>
           </w:p>
@@ -2886,6 +2927,9 @@
               <w:instrText xml:space="preserve"> FORMCHECKBOX </w:instrText>
             </w:r>
             <w:r>
+              <w:fldChar w:fldCharType="separate"/>
+            </w:r>
+            <w:r>
               <w:fldChar w:fldCharType="end"/>
             </w:r>
           </w:p>
@@ -2954,6 +2998,9 @@
               <w:instrText xml:space="preserve"> FORMCHECKBOX </w:instrText>
             </w:r>
             <w:r>
+              <w:fldChar w:fldCharType="separate"/>
+            </w:r>
+            <w:r>
               <w:fldChar w:fldCharType="end"/>
             </w:r>
           </w:p>
@@ -3023,6 +3070,9 @@
               <w:instrText xml:space="preserve"> FORMCHECKBOX </w:instrText>
             </w:r>
             <w:r>
+              <w:fldChar w:fldCharType="separate"/>
+            </w:r>
+            <w:r>
               <w:fldChar w:fldCharType="end"/>
             </w:r>
           </w:p>
@@ -3095,6 +3145,9 @@
             </w:r>
             <w:r>
               <w:instrText xml:space="preserve"> FORMCHECKBOX </w:instrText>
+            </w:r>
+            <w:r>
+              <w:fldChar w:fldCharType="separate"/>
             </w:r>
             <w:r>
               <w:fldChar w:fldCharType="end"/>
@@ -3391,6 +3444,9 @@
               <w:instrText xml:space="preserve"> FORMCHECKBOX </w:instrText>
             </w:r>
             <w:r>
+              <w:fldChar w:fldCharType="separate"/>
+            </w:r>
+            <w:r>
               <w:fldChar w:fldCharType="end"/>
             </w:r>
           </w:p>
@@ -3459,6 +3515,9 @@
               <w:instrText xml:space="preserve"> FORMCHECKBOX </w:instrText>
             </w:r>
             <w:r>
+              <w:fldChar w:fldCharType="separate"/>
+            </w:r>
+            <w:r>
               <w:fldChar w:fldCharType="end"/>
             </w:r>
           </w:p>
@@ -3527,6 +3586,9 @@
               <w:instrText xml:space="preserve"> FORMCHECKBOX </w:instrText>
             </w:r>
             <w:r>
+              <w:fldChar w:fldCharType="separate"/>
+            </w:r>
+            <w:r>
               <w:fldChar w:fldCharType="end"/>
             </w:r>
           </w:p>
@@ -3607,6 +3669,9 @@
             </w:r>
             <w:r>
               <w:instrText xml:space="preserve"> FORMCHECKBOX </w:instrText>
+            </w:r>
+            <w:r>
+              <w:fldChar w:fldCharType="separate"/>
             </w:r>
             <w:r>
               <w:fldChar w:fldCharType="end"/>
@@ -3695,6 +3760,9 @@
               <w:instrText xml:space="preserve"> FORMCHECKBOX </w:instrText>
             </w:r>
             <w:r>
+              <w:fldChar w:fldCharType="separate"/>
+            </w:r>
+            <w:r>
               <w:fldChar w:fldCharType="end"/>
             </w:r>
           </w:p>
@@ -3763,6 +3831,9 @@
               <w:instrText xml:space="preserve"> FORMCHECKBOX </w:instrText>
             </w:r>
             <w:r>
+              <w:fldChar w:fldCharType="separate"/>
+            </w:r>
+            <w:r>
               <w:fldChar w:fldCharType="end"/>
             </w:r>
           </w:p>
@@ -3834,6 +3905,9 @@
             </w:r>
             <w:r>
               <w:instrText xml:space="preserve"> FORMCHECKBOX </w:instrText>
+            </w:r>
+            <w:r>
+              <w:fldChar w:fldCharType="separate"/>
             </w:r>
             <w:r>
               <w:fldChar w:fldCharType="end"/>
@@ -4172,6 +4246,9 @@
               <w:instrText xml:space="preserve"> FORMCHECKBOX </w:instrText>
             </w:r>
             <w:r>
+              <w:fldChar w:fldCharType="separate"/>
+            </w:r>
+            <w:r>
               <w:fldChar w:fldCharType="end"/>
             </w:r>
           </w:p>
@@ -4240,6 +4317,9 @@
               <w:instrText xml:space="preserve"> FORMCHECKBOX </w:instrText>
             </w:r>
             <w:r>
+              <w:fldChar w:fldCharType="separate"/>
+            </w:r>
+            <w:r>
               <w:fldChar w:fldCharType="end"/>
             </w:r>
           </w:p>
@@ -4315,6 +4395,9 @@
               <w:instrText xml:space="preserve"> FORMCHECKBOX </w:instrText>
             </w:r>
             <w:r>
+              <w:fldChar w:fldCharType="separate"/>
+            </w:r>
+            <w:r>
               <w:fldChar w:fldCharType="end"/>
             </w:r>
           </w:p>
@@ -4395,6 +4478,9 @@
             </w:r>
             <w:r>
               <w:instrText xml:space="preserve"> FORMCHECKBOX </w:instrText>
+            </w:r>
+            <w:r>
+              <w:fldChar w:fldCharType="separate"/>
             </w:r>
             <w:r>
               <w:fldChar w:fldCharType="end"/>
@@ -4603,6 +4689,9 @@
               <w:instrText xml:space="preserve"> FORMCHECKBOX </w:instrText>
             </w:r>
             <w:r>
+              <w:fldChar w:fldCharType="separate"/>
+            </w:r>
+            <w:r>
               <w:fldChar w:fldCharType="end"/>
             </w:r>
           </w:p>
@@ -4715,6 +4804,9 @@
               <w:instrText xml:space="preserve"> FORMCHECKBOX </w:instrText>
             </w:r>
             <w:r>
+              <w:fldChar w:fldCharType="separate"/>
+            </w:r>
+            <w:r>
               <w:fldChar w:fldCharType="end"/>
             </w:r>
           </w:p>
@@ -4788,6 +4880,9 @@
               <w:instrText xml:space="preserve"> FORMCHECKBOX </w:instrText>
             </w:r>
             <w:r>
+              <w:fldChar w:fldCharType="separate"/>
+            </w:r>
+            <w:r>
               <w:fldChar w:fldCharType="end"/>
             </w:r>
           </w:p>
@@ -4861,6 +4956,9 @@
               <w:instrText xml:space="preserve"> FORMCHECKBOX </w:instrText>
             </w:r>
             <w:r>
+              <w:fldChar w:fldCharType="separate"/>
+            </w:r>
+            <w:r>
               <w:fldChar w:fldCharType="end"/>
             </w:r>
           </w:p>
@@ -4934,6 +5032,9 @@
               <w:instrText xml:space="preserve"> FORMCHECKBOX </w:instrText>
             </w:r>
             <w:r>
+              <w:fldChar w:fldCharType="separate"/>
+            </w:r>
+            <w:r>
               <w:fldChar w:fldCharType="end"/>
             </w:r>
           </w:p>
@@ -4944,15 +5045,7 @@
           </w:tcPr>
           <w:p>
             <w:r>
-              <w:t xml:space="preserve">Validate the </w:t>
-            </w:r>
-            <w:proofErr w:type="spellStart"/>
-            <w:r>
-              <w:t>deployability</w:t>
-            </w:r>
-            <w:proofErr w:type="spellEnd"/>
-            <w:r>
-              <w:t>.</w:t>
+              <w:t>Validate the deployability.</w:t>
             </w:r>
           </w:p>
           <w:p>
@@ -5015,6 +5108,9 @@
               <w:instrText xml:space="preserve"> FORMCHECKBOX </w:instrText>
             </w:r>
             <w:r>
+              <w:fldChar w:fldCharType="separate"/>
+            </w:r>
+            <w:r>
               <w:fldChar w:fldCharType="end"/>
             </w:r>
           </w:p>
@@ -5061,731 +5157,6 @@
       <w:pPr>
         <w:jc w:val="both"/>
       </w:pPr>
-    </w:p>
-    <w:p>
-      <w:pPr>
-        <w:pStyle w:val="Heading1"/>
-      </w:pPr>
-      <w:r>
-        <w:lastRenderedPageBreak/>
-        <w:t>Data Collection &amp; Exploration</w:t>
-      </w:r>
-    </w:p>
-    <w:tbl>
-      <w:tblPr>
-        <w:tblStyle w:val="TableGrid"/>
-        <w:tblW w:w="0" w:type="auto"/>
-        <w:tblLook w:val="04A0" w:firstRow="1" w:lastRow="0" w:firstColumn="1" w:lastColumn="0" w:noHBand="0" w:noVBand="1"/>
-      </w:tblPr>
-      <w:tblGrid>
-        <w:gridCol w:w="549"/>
-        <w:gridCol w:w="3136"/>
-        <w:gridCol w:w="5665"/>
-      </w:tblGrid>
-      <w:tr>
-        <w:tc>
-          <w:tcPr>
-            <w:tcW w:w="549" w:type="dxa"/>
-            <w:tcBorders>
-              <w:top w:val="nil"/>
-              <w:left w:val="nil"/>
-              <w:bottom w:val="nil"/>
-            </w:tcBorders>
-            <w:vAlign w:val="center"/>
-          </w:tcPr>
-          <w:p>
-            <w:pPr>
-              <w:jc w:val="center"/>
-              <w:rPr>
-                <w:b/>
-                <w:bCs/>
-              </w:rPr>
-            </w:pPr>
-          </w:p>
-        </w:tc>
-        <w:tc>
-          <w:tcPr>
-            <w:tcW w:w="3136" w:type="dxa"/>
-          </w:tcPr>
-          <w:p>
-            <w:pPr>
-              <w:jc w:val="center"/>
-              <w:rPr>
-                <w:b/>
-                <w:bCs/>
-              </w:rPr>
-            </w:pPr>
-            <w:r>
-              <w:rPr>
-                <w:b/>
-                <w:bCs/>
-              </w:rPr>
-              <w:t>Task</w:t>
-            </w:r>
-          </w:p>
-        </w:tc>
-        <w:tc>
-          <w:tcPr>
-            <w:tcW w:w="5665" w:type="dxa"/>
-          </w:tcPr>
-          <w:p>
-            <w:pPr>
-              <w:jc w:val="center"/>
-              <w:rPr>
-                <w:b/>
-                <w:bCs/>
-              </w:rPr>
-            </w:pPr>
-            <w:r>
-              <w:rPr>
-                <w:b/>
-                <w:bCs/>
-              </w:rPr>
-              <w:t>Notes</w:t>
-            </w:r>
-          </w:p>
-        </w:tc>
-      </w:tr>
-      <w:tr>
-        <w:tc>
-          <w:tcPr>
-            <w:tcW w:w="549" w:type="dxa"/>
-            <w:tcBorders>
-              <w:top w:val="nil"/>
-              <w:left w:val="nil"/>
-              <w:bottom w:val="nil"/>
-            </w:tcBorders>
-            <w:vAlign w:val="center"/>
-          </w:tcPr>
-          <w:p>
-            <w:pPr>
-              <w:jc w:val="center"/>
-            </w:pPr>
-            <w:r>
-              <w:fldChar w:fldCharType="begin">
-                <w:ffData>
-                  <w:name w:val="Check1"/>
-                  <w:enabled/>
-                  <w:calcOnExit w:val="0"/>
-                  <w:checkBox>
-                    <w:sizeAuto/>
-                    <w:default w:val="0"/>
-                  </w:checkBox>
-                </w:ffData>
-              </w:fldChar>
-            </w:r>
-            <w:r>
-              <w:instrText xml:space="preserve"> FORMCHECKBOX </w:instrText>
-            </w:r>
-            <w:r>
-              <w:fldChar w:fldCharType="end"/>
-            </w:r>
-          </w:p>
-        </w:tc>
-        <w:tc>
-          <w:tcPr>
-            <w:tcW w:w="3136" w:type="dxa"/>
-          </w:tcPr>
-          <w:p>
-            <w:r>
-              <w:t>Give data scientists access to all datasets.</w:t>
-            </w:r>
-          </w:p>
-          <w:p>
-            <w:pPr>
-              <w:rPr>
-                <w:i/>
-                <w:iCs/>
-              </w:rPr>
-            </w:pPr>
-            <w:r>
-              <w:rPr>
-                <w:i/>
-                <w:iCs/>
-              </w:rPr>
-              <w:t>Organize appropriate permissions. Purchase any commercial datasets or use synthetic data with similar properties.</w:t>
-            </w:r>
-          </w:p>
-        </w:tc>
-        <w:tc>
-          <w:tcPr>
-            <w:tcW w:w="5665" w:type="dxa"/>
-          </w:tcPr>
-          <w:p/>
-        </w:tc>
-      </w:tr>
-      <w:tr>
-        <w:tc>
-          <w:tcPr>
-            <w:tcW w:w="549" w:type="dxa"/>
-            <w:tcBorders>
-              <w:top w:val="nil"/>
-              <w:left w:val="nil"/>
-              <w:bottom w:val="nil"/>
-            </w:tcBorders>
-            <w:vAlign w:val="center"/>
-          </w:tcPr>
-          <w:p>
-            <w:pPr>
-              <w:jc w:val="center"/>
-            </w:pPr>
-            <w:r>
-              <w:fldChar w:fldCharType="begin">
-                <w:ffData>
-                  <w:name w:val="Check1"/>
-                  <w:enabled/>
-                  <w:calcOnExit w:val="0"/>
-                  <w:checkBox>
-                    <w:sizeAuto/>
-                    <w:default w:val="0"/>
-                  </w:checkBox>
-                </w:ffData>
-              </w:fldChar>
-            </w:r>
-            <w:r>
-              <w:instrText xml:space="preserve"> FORMCHECKBOX </w:instrText>
-            </w:r>
-            <w:r>
-              <w:fldChar w:fldCharType="end"/>
-            </w:r>
-          </w:p>
-        </w:tc>
-        <w:tc>
-          <w:tcPr>
-            <w:tcW w:w="3136" w:type="dxa"/>
-          </w:tcPr>
-          <w:p>
-            <w:r>
-              <w:t>Ingest the data.</w:t>
-            </w:r>
-          </w:p>
-          <w:p>
-            <w:pPr>
-              <w:rPr>
-                <w:i/>
-                <w:iCs/>
-              </w:rPr>
-            </w:pPr>
-            <w:r>
-              <w:rPr>
-                <w:i/>
-                <w:iCs/>
-              </w:rPr>
-              <w:t>For each data source, move it to the analytics environment.</w:t>
-            </w:r>
-          </w:p>
-        </w:tc>
-        <w:tc>
-          <w:tcPr>
-            <w:tcW w:w="5665" w:type="dxa"/>
-          </w:tcPr>
-          <w:p/>
-        </w:tc>
-      </w:tr>
-      <w:tr>
-        <w:tc>
-          <w:tcPr>
-            <w:tcW w:w="549" w:type="dxa"/>
-            <w:tcBorders>
-              <w:top w:val="nil"/>
-              <w:left w:val="nil"/>
-              <w:bottom w:val="nil"/>
-            </w:tcBorders>
-            <w:vAlign w:val="center"/>
-          </w:tcPr>
-          <w:p>
-            <w:pPr>
-              <w:jc w:val="center"/>
-            </w:pPr>
-            <w:r>
-              <w:fldChar w:fldCharType="begin">
-                <w:ffData>
-                  <w:name w:val="Check1"/>
-                  <w:enabled/>
-                  <w:calcOnExit w:val="0"/>
-                  <w:checkBox>
-                    <w:sizeAuto/>
-                    <w:default w:val="0"/>
-                  </w:checkBox>
-                </w:ffData>
-              </w:fldChar>
-            </w:r>
-            <w:r>
-              <w:instrText xml:space="preserve"> FORMCHECKBOX </w:instrText>
-            </w:r>
-            <w:r>
-              <w:fldChar w:fldCharType="end"/>
-            </w:r>
-          </w:p>
-        </w:tc>
-        <w:tc>
-          <w:tcPr>
-            <w:tcW w:w="3136" w:type="dxa"/>
-          </w:tcPr>
-          <w:p>
-            <w:r>
-              <w:t>Explore the data.</w:t>
-            </w:r>
-          </w:p>
-          <w:p>
-            <w:pPr>
-              <w:rPr>
-                <w:i/>
-                <w:iCs/>
-              </w:rPr>
-            </w:pPr>
-            <w:r>
-              <w:rPr>
-                <w:i/>
-                <w:iCs/>
-              </w:rPr>
-              <w:t>Visualize distribution of each variable with histogram or bar plot. Quantify missing values for each variable. Visualize relationship between features and target variable with scatter, histogram, box, or heatmap plots.</w:t>
-            </w:r>
-          </w:p>
-        </w:tc>
-        <w:tc>
-          <w:tcPr>
-            <w:tcW w:w="5665" w:type="dxa"/>
-          </w:tcPr>
-          <w:p/>
-        </w:tc>
-      </w:tr>
-      <w:tr>
-        <w:tc>
-          <w:tcPr>
-            <w:tcW w:w="549" w:type="dxa"/>
-            <w:tcBorders>
-              <w:top w:val="nil"/>
-              <w:left w:val="nil"/>
-              <w:bottom w:val="nil"/>
-            </w:tcBorders>
-            <w:vAlign w:val="center"/>
-          </w:tcPr>
-          <w:p>
-            <w:pPr>
-              <w:jc w:val="center"/>
-            </w:pPr>
-            <w:r>
-              <w:fldChar w:fldCharType="begin">
-                <w:ffData>
-                  <w:name w:val="Check1"/>
-                  <w:enabled/>
-                  <w:calcOnExit w:val="0"/>
-                  <w:checkBox>
-                    <w:sizeAuto/>
-                    <w:default w:val="0"/>
-                  </w:checkBox>
-                </w:ffData>
-              </w:fldChar>
-            </w:r>
-            <w:r>
-              <w:instrText xml:space="preserve"> FORMCHECKBOX </w:instrText>
-            </w:r>
-            <w:r>
-              <w:fldChar w:fldCharType="end"/>
-            </w:r>
-          </w:p>
-        </w:tc>
-        <w:tc>
-          <w:tcPr>
-            <w:tcW w:w="3136" w:type="dxa"/>
-          </w:tcPr>
-          <w:p>
-            <w:r>
-              <w:t>Determine key performance indicators to measure success.</w:t>
-            </w:r>
-          </w:p>
-          <w:p>
-            <w:pPr>
-              <w:rPr>
-                <w:i/>
-                <w:iCs/>
-              </w:rPr>
-            </w:pPr>
-            <w:r>
-              <w:rPr>
-                <w:i/>
-                <w:iCs/>
-              </w:rPr>
-              <w:t>For each dataset: provide a summary, describe high-level data quality issues, describe the quality of target variable, describe quality of each feature, describe relationship between each feature and the target variable.</w:t>
-            </w:r>
-          </w:p>
-        </w:tc>
-        <w:tc>
-          <w:tcPr>
-            <w:tcW w:w="5665" w:type="dxa"/>
-          </w:tcPr>
-          <w:p/>
-        </w:tc>
-      </w:tr>
-    </w:tbl>
-    <w:p>
-      <w:r>
-        <w:br w:type="page"/>
-      </w:r>
-    </w:p>
-    <w:tbl>
-      <w:tblPr>
-        <w:tblStyle w:val="TableGrid"/>
-        <w:tblW w:w="0" w:type="auto"/>
-        <w:tblLook w:val="04A0" w:firstRow="1" w:lastRow="0" w:firstColumn="1" w:lastColumn="0" w:noHBand="0" w:noVBand="1"/>
-      </w:tblPr>
-      <w:tblGrid>
-        <w:gridCol w:w="549"/>
-        <w:gridCol w:w="3136"/>
-        <w:gridCol w:w="5665"/>
-      </w:tblGrid>
-      <w:tr>
-        <w:tc>
-          <w:tcPr>
-            <w:tcW w:w="549" w:type="dxa"/>
-            <w:tcBorders>
-              <w:top w:val="nil"/>
-              <w:left w:val="nil"/>
-              <w:bottom w:val="nil"/>
-            </w:tcBorders>
-            <w:vAlign w:val="center"/>
-          </w:tcPr>
-          <w:p>
-            <w:pPr>
-              <w:jc w:val="center"/>
-            </w:pPr>
-            <w:r>
-              <w:lastRenderedPageBreak/>
-              <w:fldChar w:fldCharType="begin">
-                <w:ffData>
-                  <w:name w:val="Check1"/>
-                  <w:enabled/>
-                  <w:calcOnExit w:val="0"/>
-                  <w:checkBox>
-                    <w:sizeAuto/>
-                    <w:default w:val="0"/>
-                  </w:checkBox>
-                </w:ffData>
-              </w:fldChar>
-            </w:r>
-            <w:r>
-              <w:instrText xml:space="preserve"> FORMCHECKBOX </w:instrText>
-            </w:r>
-            <w:r>
-              <w:fldChar w:fldCharType="end"/>
-            </w:r>
-          </w:p>
-        </w:tc>
-        <w:tc>
-          <w:tcPr>
-            <w:tcW w:w="3136" w:type="dxa"/>
-          </w:tcPr>
-          <w:p>
-            <w:r>
-              <w:t>Decide whether or not to proceed with the project.</w:t>
-            </w:r>
-          </w:p>
-          <w:p>
-            <w:pPr>
-              <w:rPr>
-                <w:i/>
-                <w:iCs/>
-              </w:rPr>
-            </w:pPr>
-            <w:r>
-              <w:rPr>
-                <w:i/>
-                <w:iCs/>
-              </w:rPr>
-              <w:t>Continue, pause, or cancel.</w:t>
-            </w:r>
-          </w:p>
-        </w:tc>
-        <w:tc>
-          <w:tcPr>
-            <w:tcW w:w="5665" w:type="dxa"/>
-          </w:tcPr>
-          <w:p/>
-        </w:tc>
-      </w:tr>
-      <w:tr>
-        <w:tc>
-          <w:tcPr>
-            <w:tcW w:w="549" w:type="dxa"/>
-            <w:tcBorders>
-              <w:top w:val="nil"/>
-              <w:left w:val="nil"/>
-              <w:bottom w:val="nil"/>
-            </w:tcBorders>
-            <w:vAlign w:val="center"/>
-          </w:tcPr>
-          <w:p>
-            <w:pPr>
-              <w:jc w:val="center"/>
-            </w:pPr>
-            <w:r>
-              <w:fldChar w:fldCharType="begin">
-                <w:ffData>
-                  <w:name w:val="Check1"/>
-                  <w:enabled/>
-                  <w:calcOnExit w:val="0"/>
-                  <w:checkBox>
-                    <w:sizeAuto/>
-                    <w:default w:val="0"/>
-                  </w:checkBox>
-                </w:ffData>
-              </w:fldChar>
-            </w:r>
-            <w:r>
-              <w:instrText xml:space="preserve"> FORMCHECKBOX </w:instrText>
-            </w:r>
-            <w:r>
-              <w:fldChar w:fldCharType="end"/>
-            </w:r>
-          </w:p>
-        </w:tc>
-        <w:tc>
-          <w:tcPr>
-            <w:tcW w:w="3136" w:type="dxa"/>
-          </w:tcPr>
-          <w:p>
-            <w:r>
-              <w:t>Build a data pipeline.</w:t>
-            </w:r>
-          </w:p>
-          <w:p>
-            <w:pPr>
-              <w:rPr>
-                <w:i/>
-                <w:iCs/>
-              </w:rPr>
-            </w:pPr>
-            <w:r>
-              <w:rPr>
-                <w:i/>
-                <w:iCs/>
-              </w:rPr>
-              <w:t>Pipeline should automate the ingestion and cleaning process. Should run as batch or stream job.</w:t>
-            </w:r>
-          </w:p>
-        </w:tc>
-        <w:tc>
-          <w:tcPr>
-            <w:tcW w:w="5665" w:type="dxa"/>
-            <w:vAlign w:val="center"/>
-          </w:tcPr>
-          <w:p>
-            <w:pPr>
-              <w:jc w:val="center"/>
-            </w:pPr>
-          </w:p>
-        </w:tc>
-      </w:tr>
-      <w:tr>
-        <w:tc>
-          <w:tcPr>
-            <w:tcW w:w="549" w:type="dxa"/>
-            <w:tcBorders>
-              <w:top w:val="nil"/>
-              <w:left w:val="nil"/>
-              <w:bottom w:val="nil"/>
-            </w:tcBorders>
-            <w:vAlign w:val="center"/>
-          </w:tcPr>
-          <w:p>
-            <w:pPr>
-              <w:jc w:val="center"/>
-            </w:pPr>
-            <w:r>
-              <w:fldChar w:fldCharType="begin">
-                <w:ffData>
-                  <w:name w:val="Check1"/>
-                  <w:enabled/>
-                  <w:calcOnExit w:val="0"/>
-                  <w:checkBox>
-                    <w:sizeAuto/>
-                    <w:default w:val="0"/>
-                  </w:checkBox>
-                </w:ffData>
-              </w:fldChar>
-            </w:r>
-            <w:r>
-              <w:instrText xml:space="preserve"> FORMCHECKBOX </w:instrText>
-            </w:r>
-            <w:r>
-              <w:fldChar w:fldCharType="end"/>
-            </w:r>
-          </w:p>
-        </w:tc>
-        <w:tc>
-          <w:tcPr>
-            <w:tcW w:w="3136" w:type="dxa"/>
-          </w:tcPr>
-          <w:p>
-            <w:r>
-              <w:t>Document the data pipeline.</w:t>
-            </w:r>
-          </w:p>
-          <w:p>
-            <w:pPr>
-              <w:rPr>
-                <w:i/>
-                <w:iCs/>
-              </w:rPr>
-            </w:pPr>
-            <w:r>
-              <w:rPr>
-                <w:i/>
-                <w:iCs/>
-              </w:rPr>
-              <w:t>Draw diagram of steps in the data pipeline and their dependences. Describe what happens in each step.</w:t>
-            </w:r>
-          </w:p>
-        </w:tc>
-        <w:tc>
-          <w:tcPr>
-            <w:tcW w:w="5665" w:type="dxa"/>
-            <w:vAlign w:val="center"/>
-          </w:tcPr>
-          <w:p>
-            <w:pPr>
-              <w:jc w:val="center"/>
-            </w:pPr>
-            <w:r>
-              <w:t>Do external to this document.</w:t>
-            </w:r>
-          </w:p>
-        </w:tc>
-      </w:tr>
-    </w:tbl>
-    <w:p>
-      <w:pPr>
-        <w:jc w:val="both"/>
-      </w:pPr>
-      <w:r>
-        <w:rPr>
-          <w:noProof/>
-        </w:rPr>
-        <mc:AlternateContent>
-          <mc:Choice Requires="wps">
-            <w:drawing>
-              <wp:anchor distT="0" distB="0" distL="114300" distR="114300" simplePos="0" relativeHeight="251689984" behindDoc="0" locked="0" layoutInCell="1" allowOverlap="1" wp14:anchorId="377CAB34" wp14:editId="45A26B72">
-                <wp:simplePos x="0" y="0"/>
-                <wp:positionH relativeFrom="column">
-                  <wp:posOffset>-905933</wp:posOffset>
-                </wp:positionH>
-                <wp:positionV relativeFrom="paragraph">
-                  <wp:posOffset>-3878580</wp:posOffset>
-                </wp:positionV>
-                <wp:extent cx="7772400" cy="491067"/>
-                <wp:effectExtent l="0" t="0" r="0" b="0"/>
-                <wp:wrapNone/>
-                <wp:docPr id="624538659" name="Rectangle 8"/>
-                <wp:cNvGraphicFramePr/>
-                <a:graphic xmlns:a="http://schemas.openxmlformats.org/drawingml/2006/main">
-                  <a:graphicData uri="http://schemas.microsoft.com/office/word/2010/wordprocessingShape">
-                    <wps:wsp>
-                      <wps:cNvSpPr/>
-                      <wps:spPr>
-                        <a:xfrm>
-                          <a:off x="0" y="0"/>
-                          <a:ext cx="7772400" cy="491067"/>
-                        </a:xfrm>
-                        <a:prstGeom prst="rect">
-                          <a:avLst/>
-                        </a:prstGeom>
-                        <a:noFill/>
-                        <a:ln>
-                          <a:noFill/>
-                        </a:ln>
-                      </wps:spPr>
-                      <wps:style>
-                        <a:lnRef idx="2">
-                          <a:schemeClr val="accent1">
-                            <a:shade val="15000"/>
-                          </a:schemeClr>
-                        </a:lnRef>
-                        <a:fillRef idx="1">
-                          <a:schemeClr val="accent1"/>
-                        </a:fillRef>
-                        <a:effectRef idx="0">
-                          <a:schemeClr val="accent1"/>
-                        </a:effectRef>
-                        <a:fontRef idx="minor">
-                          <a:schemeClr val="lt1"/>
-                        </a:fontRef>
-                      </wps:style>
-                      <wps:txbx>
-                        <w:txbxContent>
-                          <w:p>
-                            <w:pPr>
-                              <w:jc w:val="center"/>
-                              <w:rPr>
-                                <w:color w:val="000000" w:themeColor="text1"/>
-                                <w:sz w:val="20"/>
-                                <w:szCs w:val="20"/>
-                              </w:rPr>
-                            </w:pPr>
-                            <w:r>
-                              <w:rPr>
-                                <w:color w:val="000000" w:themeColor="text1"/>
-                                <w:sz w:val="20"/>
-                                <w:szCs w:val="20"/>
-                              </w:rPr>
-                              <w:t>Data Collection &amp; Exploration</w:t>
-                            </w:r>
-                          </w:p>
-                        </w:txbxContent>
-                      </wps:txbx>
-                      <wps:bodyPr rot="0" spcFirstLastPara="0" vertOverflow="overflow" horzOverflow="overflow" vert="horz" wrap="square" lIns="91440" tIns="45720" rIns="91440" bIns="45720" numCol="1" spcCol="0" rtlCol="0" fromWordArt="0" anchor="ctr" anchorCtr="0" forceAA="0" compatLnSpc="1">
-                        <a:prstTxWarp prst="textNoShape">
-                          <a:avLst/>
-                        </a:prstTxWarp>
-                        <a:noAutofit/>
-                      </wps:bodyPr>
-                    </wps:wsp>
-                  </a:graphicData>
-                </a:graphic>
-                <wp14:sizeRelH relativeFrom="margin">
-                  <wp14:pctWidth>0</wp14:pctWidth>
-                </wp14:sizeRelH>
-                <wp14:sizeRelV relativeFrom="margin">
-                  <wp14:pctHeight>0</wp14:pctHeight>
-                </wp14:sizeRelV>
-              </wp:anchor>
-            </w:drawing>
-          </mc:Choice>
-          <mc:Fallback>
-            <w:pict>
-              <v:rect w14:anchorId="377CAB34" id="_x0000_s1036" style="position:absolute;left:0;text-align:left;margin-left:-71.35pt;margin-top:-305.4pt;width:612pt;height:38.65pt;z-index:251689984;visibility:visible;mso-wrap-style:square;mso-width-percent:0;mso-height-percent:0;mso-wrap-distance-left:9pt;mso-wrap-distance-top:0;mso-wrap-distance-right:9pt;mso-wrap-distance-bottom:0;mso-position-horizontal:absolute;mso-position-horizontal-relative:text;mso-position-vertical:absolute;mso-position-vertical-relative:text;mso-width-percent:0;mso-height-percent:0;mso-width-relative:margin;mso-height-relative:margin;v-text-anchor:middle" o:gfxdata="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" filled="f" stroked="f" strokeweight="1pt">
-                <v:textbox>
-                  <w:txbxContent>
-                    <w:p>
-                      <w:pPr>
-                        <w:jc w:val="center"/>
-                        <w:rPr>
-                          <w:color w:val="000000" w:themeColor="text1"/>
-                          <w:sz w:val="20"/>
-                          <w:szCs w:val="20"/>
-                        </w:rPr>
-                      </w:pPr>
-                      <w:r>
-                        <w:rPr>
-                          <w:color w:val="000000" w:themeColor="text1"/>
-                          <w:sz w:val="20"/>
-                          <w:szCs w:val="20"/>
-                        </w:rPr>
-                        <w:t>Data Collection &amp; Exploration</w:t>
-                      </w:r>
-                    </w:p>
-                  </w:txbxContent>
-                </v:textbox>
-              </v:rect>
-            </w:pict>
-          </mc:Fallback>
-        </mc:AlternateContent>
-      </w:r>
-    </w:p>
-    <w:p>
-      <w:r>
-        <w:br w:type="page"/>
-      </w:r>
     </w:p>
     <w:p>
       <w:pPr>
@@ -5951,6 +5322,9 @@
               <w:instrText xml:space="preserve"> FORMCHECKBOX </w:instrText>
             </w:r>
             <w:r>
+              <w:fldChar w:fldCharType="separate"/>
+            </w:r>
+            <w:r>
               <w:fldChar w:fldCharType="end"/>
             </w:r>
           </w:p>
@@ -6019,6 +5393,9 @@
               <w:instrText xml:space="preserve"> FORMCHECKBOX </w:instrText>
             </w:r>
             <w:r>
+              <w:fldChar w:fldCharType="separate"/>
+            </w:r>
+            <w:r>
               <w:fldChar w:fldCharType="end"/>
             </w:r>
           </w:p>
@@ -6094,6 +5471,9 @@
               <w:instrText xml:space="preserve"> FORMCHECKBOX </w:instrText>
             </w:r>
             <w:r>
+              <w:fldChar w:fldCharType="separate"/>
+            </w:r>
+            <w:r>
               <w:fldChar w:fldCharType="end"/>
             </w:r>
           </w:p>
@@ -6165,6 +5545,9 @@
               <w:instrText xml:space="preserve"> FORMCHECKBOX </w:instrText>
             </w:r>
             <w:r>
+              <w:fldChar w:fldCharType="separate"/>
+            </w:r>
+            <w:r>
               <w:fldChar w:fldCharType="end"/>
             </w:r>
           </w:p>
@@ -6233,6 +5616,9 @@
               <w:instrText xml:space="preserve"> FORMCHECKBOX </w:instrText>
             </w:r>
             <w:r>
+              <w:fldChar w:fldCharType="separate"/>
+            </w:r>
+            <w:r>
               <w:fldChar w:fldCharType="end"/>
             </w:r>
           </w:p>
@@ -6301,6 +5687,9 @@
               <w:instrText xml:space="preserve"> FORMCHECKBOX </w:instrText>
             </w:r>
             <w:r>
+              <w:fldChar w:fldCharType="separate"/>
+            </w:r>
+            <w:r>
               <w:fldChar w:fldCharType="end"/>
             </w:r>
           </w:p>
@@ -6422,6 +5811,9 @@
               <w:instrText xml:space="preserve"> FORMCHECKBOX </w:instrText>
             </w:r>
             <w:r>
+              <w:fldChar w:fldCharType="separate"/>
+            </w:r>
+            <w:r>
               <w:fldChar w:fldCharType="end"/>
             </w:r>
           </w:p>
@@ -6496,6 +5888,9 @@
             </w:r>
             <w:r>
               <w:instrText xml:space="preserve"> FORMCHECKBOX </w:instrText>
+            </w:r>
+            <w:r>
+              <w:fldChar w:fldCharType="separate"/>
             </w:r>
             <w:r>
               <w:fldChar w:fldCharType="end"/>
@@ -6789,6 +6184,9 @@
               <w:instrText xml:space="preserve"> FORMCHECKBOX </w:instrText>
             </w:r>
             <w:r>
+              <w:fldChar w:fldCharType="separate"/>
+            </w:r>
+            <w:r>
               <w:fldChar w:fldCharType="end"/>
             </w:r>
           </w:p>
@@ -6864,6 +6262,9 @@
               <w:instrText xml:space="preserve"> FORMCHECKBOX </w:instrText>
             </w:r>
             <w:r>
+              <w:fldChar w:fldCharType="separate"/>
+            </w:r>
+            <w:r>
               <w:fldChar w:fldCharType="end"/>
             </w:r>
           </w:p>
@@ -6930,6 +6331,9 @@
             </w:r>
             <w:r>
               <w:instrText xml:space="preserve"> FORMCHECKBOX </w:instrText>
+            </w:r>
+            <w:r>
+              <w:fldChar w:fldCharType="separate"/>
             </w:r>
             <w:r>
               <w:fldChar w:fldCharType="end"/>
@@ -8322,6 +7726,7 @@
   <w:style w:type="character" w:default="1" w:styleId="DefaultParagraphFont">
     <w:name w:val="Default Paragraph Font"/>
     <w:uiPriority w:val="1"/>
+    <w:semiHidden/>
     <w:unhideWhenUsed/>
   </w:style>
   <w:style w:type="table" w:default="1" w:styleId="TableNormal">

</xml_diff>